<commit_message>
Deploy regiments off the table at the own or a side edge; Command button next to LoS
Deploying from reserve now places the regiment behind the edge line with its
front rank touching the edge: centred on the own long edge, or against the
left/right side edge (as seen by the owner) at the owner's end, sliding to the
nearest free spot. Fit also frames regiments waiting off the table. The
Command button moves between LoS and Draw terrain. README and Word guide
updated.

Co-Authored-By: Claude Opus 5.5 <noreply@anthropic.com>
Claude-Session: https://claude.ai/code/session_01W7rP3oYg9r5Ui3ygLpD7X3
</commit_message>
<xml_diff>
--- a/docs/Conquest-Tabletop-Guide.docx
+++ b/docs/Conquest-Tabletop-Guide.docx
@@ -2588,6 +2588,71 @@
                 <w:b/>
                 <w:bCs/>
               </w:rPr>
+              <w:t xml:space="preserve">Command</w:t>
+            </w:r>
+            <w:r>
+              <w:t xml:space="preserve"> </w:t>
+            </w:r>
+            <w:r>
+              <w:rPr>
+                <w:rFonts w:ascii="Consolas" w:cs="Consolas" w:eastAsia="Consolas" w:hAnsi="Consolas"/>
+                <w:sz w:val="19"/>
+                <w:szCs w:val="19"/>
+                <w:shd w:fill="EEEAE0" w:color="auto" w:val="clear"/>
+              </w:rPr>
+              <w:t xml:space="preserve">C</w:t>
+            </w:r>
+          </w:p>
+        </w:tc>
+        <w:tc>
+          <w:tcPr>
+            <w:tcW w:type="dxa" w:w="5777"/>
+            <w:tcBorders>
+              <w:top w:val="single" w:color="D9D4C7" w:sz="4"/>
+              <w:left w:val="single" w:color="D9D4C7" w:sz="4"/>
+              <w:bottom w:val="single" w:color="D9D4C7" w:sz="4"/>
+              <w:right w:val="single" w:color="D9D4C7" w:sz="4"/>
+            </w:tcBorders>
+            <w:tcMar>
+              <w:top w:type="dxa" w:w="60"/>
+              <w:left w:type="dxa" w:w="100"/>
+              <w:bottom w:type="dxa" w:w="60"/>
+              <w:right w:type="dxa" w:w="100"/>
+            </w:tcMar>
+          </w:tcPr>
+          <w:p>
+            <w:r>
+              <w:t xml:space="preserve">Open the command stacks</w:t>
+            </w:r>
+          </w:p>
+        </w:tc>
+      </w:tr>
+      <w:tr>
+        <w:trPr>
+          <w:cantSplit/>
+        </w:trPr>
+        <w:tc>
+          <w:tcPr>
+            <w:tcW w:type="dxa" w:w="3249"/>
+            <w:tcBorders>
+              <w:top w:val="single" w:color="D9D4C7" w:sz="4"/>
+              <w:left w:val="single" w:color="D9D4C7" w:sz="4"/>
+              <w:bottom w:val="single" w:color="D9D4C7" w:sz="4"/>
+              <w:right w:val="single" w:color="D9D4C7" w:sz="4"/>
+            </w:tcBorders>
+            <w:tcMar>
+              <w:top w:type="dxa" w:w="60"/>
+              <w:left w:type="dxa" w:w="100"/>
+              <w:bottom w:type="dxa" w:w="60"/>
+              <w:right w:type="dxa" w:w="100"/>
+            </w:tcMar>
+          </w:tcPr>
+          <w:p>
+            <w:r>
+              <w:rPr>
+                <w:b/>
+                <w:bCs/>
+              </w:rPr>
               <w:t xml:space="preserve">Draw terrain</w:t>
             </w:r>
             <w:r>
@@ -3111,28 +3176,6 @@
               </w:rPr>
               <w:t xml:space="preserve">X</w:t>
             </w:r>
-            <w:r>
-              <w:t xml:space="preserve"> · </w:t>
-            </w:r>
-            <w:r>
-              <w:rPr>
-                <w:b/>
-                <w:bCs/>
-              </w:rPr>
-              <w:t xml:space="preserve">Command</w:t>
-            </w:r>
-            <w:r>
-              <w:t xml:space="preserve"> </w:t>
-            </w:r>
-            <w:r>
-              <w:rPr>
-                <w:rFonts w:ascii="Consolas" w:cs="Consolas" w:eastAsia="Consolas" w:hAnsi="Consolas"/>
-                <w:sz w:val="19"/>
-                <w:szCs w:val="19"/>
-                <w:shd w:fill="EEEAE0" w:color="auto" w:val="clear"/>
-              </w:rPr>
-              <w:t xml:space="preserve">C</w:t>
-            </w:r>
           </w:p>
         </w:tc>
         <w:tc>
@@ -3153,7 +3196,7 @@
           </w:tcPr>
           <w:p>
             <w:r>
-              <w:t xml:space="preserve">Open the dice tray or the command stacks</w:t>
+              <w:t xml:space="preserve">Open the dice tray</w:t>
             </w:r>
           </w:p>
         </w:tc>
@@ -4743,7 +4786,7 @@
                 <w:b/>
                 <w:bCs/>
               </w:rPr>
-              <w:t xml:space="preserve">Deploy to edge</w:t>
+              <w:t xml:space="preserve">Deploy: Own edge / Left edge / Right edge</w:t>
             </w:r>
             <w:r>
               <w:t xml:space="preserve">, </w:t>
@@ -5067,17 +5110,50 @@
         <w:spacing w:after="60"/>
       </w:pPr>
       <w:r>
-        <w:t xml:space="preserve">Drag a reserve row from the roster onto the board where you want it, or press </w:t>
+        <w:t xml:space="preserve">In the inspector, </w:t>
       </w:r>
       <w:r>
         <w:rPr>
           <w:b/>
           <w:bCs/>
         </w:rPr>
-        <w:t xml:space="preserve">Deploy to edge</w:t>
-      </w:r>
-      <w:r>
-        <w:t xml:space="preserve"> in the inspector.</w:t>
+        <w:t xml:space="preserve">Deploy: Own edge</w:t>
+      </w:r>
+      <w:r>
+        <w:t xml:space="preserve"> places the regiment off the table, its front rank touching your long edge, centred. </w:t>
+      </w:r>
+      <w:r>
+        <w:rPr>
+          <w:b/>
+          <w:bCs/>
+        </w:rPr>
+        <w:t xml:space="preserve">Left edge</w:t>
+      </w:r>
+      <w:r>
+        <w:t xml:space="preserve"> / </w:t>
+      </w:r>
+      <w:r>
+        <w:rPr>
+          <w:b/>
+          <w:bCs/>
+        </w:rPr>
+        <w:t xml:space="preserve">Right edge</w:t>
+      </w:r>
+      <w:r>
+        <w:t xml:space="preserve"> place it against that side edge at your end of the table, facing in. Left and right are as seen from your own edge. If the spot is taken, it slides along the edge to the nearest free place.</w:t>
+      </w:r>
+    </w:p>
+    <w:p>
+      <w:pPr>
+        <w:pStyle w:val="ListParagraph"/>
+        <w:numPr>
+          <w:ilvl w:val="0"/>
+          <w:numId w:val="3"/>
+        </w:numPr>
+        <w:spacing w:after="60"/>
+      </w:pPr>
+      <w:r>
+        <w:t xml:space="preserve">Or drag a reserve row from the roster onto the board exactly where you want it.</w:t>
       </w:r>
     </w:p>
     <w:p>

</xml_diff>